<commit_message>
fix: AI sovereignty memo v2 — Legislative Yuan role, ZH translation summaries for US messages
</commit_message>
<xml_diff>
--- a/public/files/ai-sovereignty-three-tables/ai-sovereignty-three-tables-zh.docx
+++ b/public/files/ai-sovereignty-three-tables/ai-sovereignty-three-tables-zh.docx
@@ -2,18 +2,7 @@
 <file path=word/document.xml><?xml version="1.0" encoding="utf-8"?>
 <w:document xmlns:w="http://schemas.openxmlformats.org/wordprocessingml/2006/main" xmlns:m="http://schemas.openxmlformats.org/officeDocument/2006/math" xmlns:r="http://schemas.openxmlformats.org/officeDocument/2006/relationships" xmlns:o="urn:schemas-microsoft-com:office:office" xmlns:v="urn:schemas-microsoft-com:vml" xmlns:w10="urn:schemas-microsoft-com:office:word" xmlns:a="http://schemas.openxmlformats.org/drawingml/2006/main" xmlns:pic="http://schemas.openxmlformats.org/drawingml/2006/picture" xmlns:wp="http://schemas.openxmlformats.org/drawingml/2006/wordprocessingDrawing">
   <w:body>
-    <w:p>
-      <w:pPr>
-        <w:pStyle w:val="Title"/>
-      </w:pPr>
-      <w:r>
-        <w:rPr>
-          <w:rFonts w:hint="eastAsia"/>
-        </w:rPr>
-        <w:t xml:space="preserve">沒有算力主權，就沒有國家主權</w:t>
-      </w:r>
-    </w:p>
-    <w:bookmarkStart w:id="30" w:name="沒有算力主權就沒有國家主權"/>
+    <w:bookmarkStart w:id="28" w:name="沒有算力主權就沒有國家主權"/>
     <w:p>
       <w:pPr>
         <w:pStyle w:val="Heading1"/>
@@ -706,18 +695,10 @@
         <w:rPr>
           <w:rFonts w:hint="eastAsia"/>
         </w:rPr>
-        <w:t xml:space="preserve">教宗講的是</w:t>
-      </w:r>
-      <w:r>
-        <w:rPr>
-          <w:rFonts w:hint="eastAsia"/>
-          <w:b/>
-          <w:bCs/>
-        </w:rPr>
-        <w:t xml:space="preserve">「人類主權」</w:t>
-      </w:r>
-      <w:r>
-        <w:t xml:space="preserve">——AI </w:t>
+        <w:t xml:space="preserve">教宗講的是**「人類主權」**——AI</w:t>
+      </w:r>
+      <w:r>
+        <w:t xml:space="preserve"> </w:t>
       </w:r>
       <w:r>
         <w:rPr>
@@ -738,18 +719,10 @@
         <w:rPr>
           <w:rFonts w:hint="eastAsia"/>
         </w:rPr>
-        <w:t xml:space="preserve">川普做的是</w:t>
-      </w:r>
-      <w:r>
-        <w:rPr>
-          <w:rFonts w:hint="eastAsia"/>
-          <w:b/>
-          <w:bCs/>
-        </w:rPr>
-        <w:t xml:space="preserve">「美國主權」</w:t>
-      </w:r>
-      <w:r>
-        <w:t xml:space="preserve">——AI </w:t>
+        <w:t xml:space="preserve">川普做的是**「美國主權」**——AI</w:t>
+      </w:r>
+      <w:r>
+        <w:t xml:space="preserve"> </w:t>
       </w:r>
       <w:r>
         <w:rPr>
@@ -770,21 +743,7 @@
         <w:rPr>
           <w:rFonts w:hint="eastAsia"/>
         </w:rPr>
-        <w:t xml:space="preserve">台灣現在欠的，是</w:t>
-      </w:r>
-      <w:r>
-        <w:rPr>
-          <w:rFonts w:hint="eastAsia"/>
-          <w:b/>
-          <w:bCs/>
-        </w:rPr>
-        <w:t xml:space="preserve">「台灣主權」</w:t>
-      </w:r>
-      <w:r>
-        <w:rPr>
-          <w:rFonts w:hint="eastAsia"/>
-        </w:rPr>
-        <w:t xml:space="preserve">——我們對自己使用、調度、儲備、佈署算力的能力，必須是自己的。</w:t>
+        <w:t xml:space="preserve">台灣現在欠的，是**「台灣主權」**——我們對自己使用、調度、儲備、佈署算力的能力，必須是自己的。</w:t>
       </w:r>
     </w:p>
     <w:p>
@@ -934,7 +893,7 @@
           <w:b/>
           <w:bCs/>
         </w:rPr>
-        <w:t xml:space="preserve">我希望總統府跟國發會的同仁，看完當天就能</w:t>
+        <w:t xml:space="preserve">我希望總統府、行政院與立法院的同仁，看完當天就能</w:t>
       </w:r>
       <w:r>
         <w:rPr>
@@ -953,6 +912,53 @@
       </w:r>
       <w:r>
         <w:t xml:space="preserve">。</w:t>
+      </w:r>
+    </w:p>
+    <w:p>
+      <w:pPr>
+        <w:pStyle w:val="BodyText"/>
+      </w:pPr>
+      <w:r>
+        <w:rPr>
+          <w:rFonts w:hint="eastAsia"/>
+        </w:rPr>
+        <w:t xml:space="preserve">需要先說的是：以下三件事，</w:t>
+      </w:r>
+      <w:r>
+        <w:rPr>
+          <w:rFonts w:hint="eastAsia"/>
+          <w:b/>
+          <w:bCs/>
+        </w:rPr>
+        <w:t xml:space="preserve">沒有一件是行政院一個部會可以單獨完成的</w:t>
+      </w:r>
+      <w:r>
+        <w:rPr>
+          <w:rFonts w:hint="eastAsia"/>
+        </w:rPr>
+        <w:t xml:space="preserve">。主權基金規模讓立法院沒討論就出去、戰略算力預購额度讓立法院沒討論就簽約、算力外交綱領讓立法院沒討論就上路——三條都不可能長久。</w:t>
+      </w:r>
+    </w:p>
+    <w:p>
+      <w:pPr>
+        <w:pStyle w:val="BodyText"/>
+      </w:pPr>
+      <w:r>
+        <w:rPr>
+          <w:rFonts w:hint="eastAsia"/>
+          <w:b/>
+          <w:bCs/>
+        </w:rPr>
+        <w:t xml:space="preserve">台灣的算力主權路線，必須由行政跟立法兩大門共同肩負。</w:t>
+      </w:r>
+      <w:r>
+        <w:t xml:space="preserve"> </w:t>
+      </w:r>
+      <w:r>
+        <w:rPr>
+          <w:rFonts w:hint="eastAsia"/>
+        </w:rPr>
+        <w:t xml:space="preserve">這不是放哪個部會的問題，這是「是否能讓下一任總統、下下任總統都不能推翻」的問題。來自立法者的授權與監督，是這三個訊息能不能跨代的關鍵。</w:t>
       </w:r>
     </w:p>
     <w:bookmarkStart w:id="15" w:name="訊息一把算力主權寫進國家安全戰略"/>
@@ -1305,7 +1311,35 @@
         <w:rPr>
           <w:rFonts w:hint="eastAsia"/>
         </w:rPr>
-        <w:t xml:space="preserve">由國發基金主導、財政部監理，仿照新加坡</w:t>
+        <w:t xml:space="preserve">由</w:t>
+      </w:r>
+      <w:r>
+        <w:rPr>
+          <w:rFonts w:hint="eastAsia"/>
+          <w:b/>
+          <w:bCs/>
+        </w:rPr>
+        <w:t xml:space="preserve">立法院制定基金設置條例與監督機制</w:t>
+      </w:r>
+      <w:r>
+        <w:rPr>
+          <w:rFonts w:hint="eastAsia"/>
+        </w:rPr>
+        <w:t xml:space="preserve">，授權國發基金主導、財政部監理，並向</w:t>
+      </w:r>
+      <w:r>
+        <w:rPr>
+          <w:rFonts w:hint="eastAsia"/>
+          <w:b/>
+          <w:bCs/>
+        </w:rPr>
+        <w:t xml:space="preserve">立法院財政委員會、經濟委員會年度提報運作成果</w:t>
+      </w:r>
+      <w:r>
+        <w:rPr>
+          <w:rFonts w:hint="eastAsia"/>
+        </w:rPr>
+        <w:t xml:space="preserve">。仿照新加坡</w:t>
       </w:r>
       <w:r>
         <w:t xml:space="preserve"> </w:t>
@@ -1520,7 +1554,21 @@
         <w:rPr>
           <w:rFonts w:hint="eastAsia"/>
         </w:rPr>
-        <w:t xml:space="preserve">（SPR）的法律機制，建立</w:t>
+        <w:t xml:space="preserve">（SPR）的法律機制，</w:t>
+      </w:r>
+      <w:r>
+        <w:rPr>
+          <w:rFonts w:hint="eastAsia"/>
+          <w:b/>
+          <w:bCs/>
+        </w:rPr>
+        <w:t xml:space="preserve">由立法院制定母法授權</w:t>
+      </w:r>
+      <w:r>
+        <w:rPr>
+          <w:rFonts w:hint="eastAsia"/>
+        </w:rPr>
+        <w:t xml:space="preserve">，建立</w:t>
       </w:r>
       <w:r>
         <w:rPr>
@@ -1572,7 +1620,21 @@
         <w:rPr>
           <w:rFonts w:hint="eastAsia"/>
         </w:rPr>
-        <w:t xml:space="preserve">由經濟部與國科會共同編列預算，</w:t>
+        <w:t xml:space="preserve">由經濟部與國科會共同編列預算、</w:t>
+      </w:r>
+      <w:r>
+        <w:rPr>
+          <w:rFonts w:hint="eastAsia"/>
+          <w:b/>
+          <w:bCs/>
+        </w:rPr>
+        <w:t xml:space="preserve">送立法院審議通過</w:t>
+      </w:r>
+      <w:r>
+        <w:rPr>
+          <w:rFonts w:hint="eastAsia"/>
+        </w:rPr>
+        <w:t xml:space="preserve">後，</w:t>
       </w:r>
       <w:r>
         <w:rPr>
@@ -1704,6 +1766,29 @@
     </w:p>
     <w:p>
       <w:pPr>
+        <w:pStyle w:val="Compact"/>
+        <w:numPr>
+          <w:ilvl w:val="0"/>
+          <w:numId w:val="1004"/>
+        </w:numPr>
+      </w:pPr>
+      <w:r>
+        <w:rPr>
+          <w:rFonts w:hint="eastAsia"/>
+          <w:b/>
+          <w:bCs/>
+        </w:rPr>
+        <w:t xml:space="preserve">立法院相關委員會每年備詢、檢討儲備規模與分散度</w:t>
+      </w:r>
+      <w:r>
+        <w:rPr>
+          <w:rFonts w:hint="eastAsia"/>
+        </w:rPr>
+        <w:t xml:space="preserve">——確保戰略算力儲備不會因政黨輪替或行政更迭而中斷。</w:t>
+      </w:r>
+    </w:p>
+    <w:p>
+      <w:pPr>
         <w:pStyle w:val="FirstParagraph"/>
       </w:pPr>
       <w:r>
@@ -1769,8 +1854,16 @@
       <w:r>
         <w:rPr>
           <w:rFonts w:hint="eastAsia"/>
-        </w:rPr>
-        <w:t xml:space="preserve">由外交部、經濟部、數發部、國科會四部會共組「</w:t>
+          <w:b/>
+          <w:bCs/>
+        </w:rPr>
+        <w:t xml:space="preserve">由立法院通過綱領性決議或專法</w:t>
+      </w:r>
+      <w:r>
+        <w:rPr>
+          <w:rFonts w:hint="eastAsia"/>
+        </w:rPr>
+        <w:t xml:space="preserve">，授權外交部、經濟部、數發部、國科會四部會共組「</w:t>
       </w:r>
       <w:r>
         <w:rPr>
@@ -1784,7 +1877,21 @@
         <w:rPr>
           <w:rFonts w:hint="eastAsia"/>
         </w:rPr>
-        <w:t xml:space="preserve">」，直屬行政院。任務：</w:t>
+        <w:t xml:space="preserve">」，直屬行政院；</w:t>
+      </w:r>
+      <w:r>
+        <w:rPr>
+          <w:rFonts w:hint="eastAsia"/>
+          <w:b/>
+          <w:bCs/>
+        </w:rPr>
+        <w:t xml:space="preserve">重大跨國協議須送立法院審議</w:t>
+      </w:r>
+      <w:r>
+        <w:rPr>
+          <w:rFonts w:hint="eastAsia"/>
+        </w:rPr>
+        <w:t xml:space="preserve">。任務：</w:t>
       </w:r>
     </w:p>
     <w:p>
@@ -2230,7 +2337,7 @@
     </w:p>
     <w:bookmarkEnd w:id="20"/>
     <w:bookmarkEnd w:id="21"/>
-    <w:bookmarkStart w:id="27" w:name="四給川普總統給美國國會的三個訊息"/>
+    <w:bookmarkStart w:id="25" w:name="四給川普總統給美國國會的三個訊息"/>
     <w:p>
       <w:pPr>
         <w:pStyle w:val="Heading2"/>
@@ -2273,7 +2380,7 @@
         <w:t xml:space="preserve">自己的語言。</w:t>
       </w:r>
     </w:p>
-    <w:bookmarkStart w:id="23" w:name="X3e23ec8cc8b175de28fecdcab8810b532b8bfc4"/>
+    <w:bookmarkStart w:id="22" w:name="X65d2a4625c3a22b8419f63ba4fa28aa0be0afe6"/>
     <w:p>
       <w:pPr>
         <w:pStyle w:val="Heading3"/>
@@ -2287,244 +2394,367 @@
         <w:pStyle w:val="FirstParagraph"/>
       </w:pPr>
       <w:r>
-        <w:t xml:space="preserve">President Trump, Members of Congress——</w:t>
-      </w:r>
-    </w:p>
-    <w:p>
-      <w:pPr>
-        <w:pStyle w:val="BodyText"/>
-      </w:pPr>
-      <w:r>
-        <w:t xml:space="preserve">The June 13 directive was correct in spirit. The United States must control its own frontier compute. No serious ally would dispute that.</w:t>
-      </w:r>
-    </w:p>
-    <w:p>
-      <w:pPr>
-        <w:pStyle w:val="BodyText"/>
-      </w:pPr>
-      <w:r>
-        <w:t xml:space="preserve">But the directive, as written, treats Taiwan the same way it treats adversarial states. That is a strategic miscalibration. Allow me to be blunt:</w:t>
-      </w:r>
-    </w:p>
-    <w:p>
-      <w:pPr>
-        <w:pStyle w:val="BodyText"/>
-      </w:pPr>
-      <w:r>
-        <w:rPr>
-          <w:b/>
-          <w:bCs/>
-        </w:rPr>
-        <w:t xml:space="preserve">Taiwan is America’s only allied terafab supplier.</w:t>
-      </w:r>
-      <w:r>
+        <w:rPr>
+          <w:rFonts w:hint="eastAsia"/>
+          <w:b/>
+          <w:bCs/>
+        </w:rPr>
+        <w:t xml:space="preserve">訊息一：把台灣當作</w:t>
+      </w:r>
+      <w:r>
+        <w:rPr>
+          <w:b/>
+          <w:bCs/>
+        </w:rPr>
+        <w:t xml:space="preserve"> Lockheed </w:t>
+      </w:r>
+      <w:r>
+        <w:rPr>
+          <w:rFonts w:hint="eastAsia"/>
+          <w:b/>
+          <w:bCs/>
+        </w:rPr>
+        <w:t xml:space="preserve">Martin，不是</w:t>
+      </w:r>
+      <w:r>
+        <w:rPr>
+          <w:b/>
+          <w:bCs/>
+        </w:rPr>
+        <w:t xml:space="preserve"> Huawei。</w:t>
+      </w:r>
+    </w:p>
+    <w:p>
+      <w:pPr>
+        <w:pStyle w:val="BodyText"/>
+      </w:pPr>
+      <w:r>
+        <w:t xml:space="preserve">6/13 </w:t>
+      </w:r>
+      <w:r>
+        <w:rPr>
+          <w:rFonts w:hint="eastAsia"/>
+        </w:rPr>
+        <w:t xml:space="preserve">命令的精神是對的——美國必須掌握自己的前沿算力，這點沒有盟邦會反對。但這道命令把台灣與敵對國家一視同仁，是戰略詤算錯誤。</w:t>
+      </w:r>
+    </w:p>
+    <w:p>
+      <w:pPr>
+        <w:pStyle w:val="BodyText"/>
+      </w:pPr>
+      <w:r>
+        <w:rPr>
+          <w:rFonts w:hint="eastAsia"/>
+          <w:b/>
+          <w:bCs/>
+        </w:rPr>
+        <w:t xml:space="preserve">台灣是美國在盟邦中唯一的</w:t>
+      </w:r>
+      <w:r>
+        <w:rPr>
+          <w:b/>
+          <w:bCs/>
+        </w:rPr>
+        <w:t xml:space="preserve"> terafab </w:t>
+      </w:r>
+      <w:r>
+        <w:rPr>
+          <w:rFonts w:hint="eastAsia"/>
+          <w:b/>
+          <w:bCs/>
+        </w:rPr>
+        <w:t xml:space="preserve">供應者</w:t>
+      </w:r>
+      <w:r>
+        <w:t xml:space="preserve">。Fable 5、Mythos </w:t>
+      </w:r>
+      <w:r>
+        <w:rPr>
+          <w:rFonts w:hint="eastAsia"/>
+        </w:rPr>
+        <w:t xml:space="preserve">5以及未來所有繼任模型跑的晶片，由台灣人、台灣廠、台灣工程製造。台積電亞利桑那</w:t>
+      </w:r>
+      <w:r>
+        <w:t xml:space="preserve"> 650 </w:t>
+      </w:r>
+      <w:r>
+        <w:rPr>
+          <w:rFonts w:hint="eastAsia"/>
+        </w:rPr>
+        <w:t xml:space="preserve">億美元、台達電</w:t>
+      </w:r>
+      <w:r>
+        <w:t xml:space="preserve"> Plano </w:t>
+      </w:r>
+      <w:r>
+        <w:rPr>
+          <w:rFonts w:hint="eastAsia"/>
+        </w:rPr>
+        <w:t xml:space="preserve">廠</w:t>
+      </w:r>
+      <w:r>
+        <w:t xml:space="preserve"> 1,500 </w:t>
+      </w:r>
+      <w:r>
+        <w:rPr>
+          <w:rFonts w:hint="eastAsia"/>
+        </w:rPr>
+        <w:t xml:space="preserve">人、東元德州</w:t>
+      </w:r>
+      <w:r>
+        <w:t xml:space="preserve"> 30 </w:t>
+      </w:r>
+      <w:r>
+        <w:rPr>
+          <w:rFonts w:hint="eastAsia"/>
+        </w:rPr>
+        <w:t xml:space="preserve">年耐耕、鴻海中西部</w:t>
+      </w:r>
+      <w:r>
+        <w:t xml:space="preserve"> 100 </w:t>
+      </w:r>
+      <w:r>
+        <w:rPr>
+          <w:rFonts w:hint="eastAsia"/>
+        </w:rPr>
+        <w:t xml:space="preserve">億美元承諾——那不是商業決策，是</w:t>
+      </w:r>
+      <w:r>
+        <w:rPr>
+          <w:rFonts w:hint="eastAsia"/>
+          <w:b/>
+          <w:bCs/>
+        </w:rPr>
+        <w:t xml:space="preserve">主權協作承諾</w:t>
+      </w:r>
+      <w:r>
+        <w:t xml:space="preserve">。</w:t>
+      </w:r>
+    </w:p>
+    <w:p>
+      <w:pPr>
+        <w:pStyle w:val="BodyText"/>
+      </w:pPr>
+      <w:r>
+        <w:rPr>
+          <w:rFonts w:hint="eastAsia"/>
+        </w:rPr>
+        <w:t xml:space="preserve">不能把甚至在幫你造武器的供應者鎖仔門外。不能在</w:t>
+      </w:r>
+      <w:r>
+        <w:t xml:space="preserve"> 2026 </w:t>
+      </w:r>
+      <w:r>
+        <w:rPr>
+          <w:rFonts w:hint="eastAsia"/>
+        </w:rPr>
+        <w:t xml:space="preserve">年，對台北跟對北京畫同一條紅線。</w:t>
+      </w:r>
+    </w:p>
+    <w:p>
+      <w:pPr>
+        <w:pStyle w:val="BlockText"/>
+      </w:pPr>
+      <w:r>
+        <w:rPr>
+          <w:rFonts w:hint="eastAsia"/>
+          <w:b/>
+          <w:bCs/>
+        </w:rPr>
+        <w:t xml:space="preserve">我們具體訴求：在</w:t>
+      </w:r>
+      <w:r>
+        <w:rPr>
+          <w:b/>
+          <w:bCs/>
+        </w:rPr>
+        <w:t xml:space="preserve"> 6/13 </w:t>
+      </w:r>
+      <w:r>
+        <w:rPr>
+          <w:rFonts w:hint="eastAsia"/>
+          <w:b/>
+          <w:bCs/>
+        </w:rPr>
+        <w:t xml:space="preserve">框架下赋予台灣「Trusted</w:t>
+      </w:r>
+      <w:r>
+        <w:rPr>
+          <w:b/>
+          <w:bCs/>
+        </w:rPr>
+        <w:t xml:space="preserve"> Foundry / Trusted Compute </w:t>
+      </w:r>
+      <w:r>
+        <w:rPr>
+          <w:rFonts w:hint="eastAsia"/>
+          <w:b/>
+          <w:bCs/>
+        </w:rPr>
+        <w:t xml:space="preserve">Supplier」地位，與</w:t>
+      </w:r>
+      <w:r>
+        <w:rPr>
+          <w:b/>
+          <w:bCs/>
+        </w:rPr>
+        <w:t xml:space="preserve"> Lockheed Martin、Raytheon </w:t>
+      </w:r>
+      <w:r>
+        <w:rPr>
+          <w:rFonts w:hint="eastAsia"/>
+          <w:b/>
+          <w:bCs/>
+        </w:rPr>
+        <w:t xml:space="preserve">等第一級國防合作夥伴同等。</w:t>
+      </w:r>
+    </w:p>
+    <w:p>
+      <w:pPr>
+        <w:pStyle w:val="FirstParagraph"/>
+      </w:pPr>
+      <w:r>
+        <w:rPr>
+          <w:rFonts w:hint="eastAsia"/>
+        </w:rPr>
+        <w:t xml:space="preserve">這不是優惠待遇，是</w:t>
+      </w:r>
+      <w:r>
+        <w:rPr>
+          <w:rFonts w:hint="eastAsia"/>
+          <w:b/>
+          <w:bCs/>
+        </w:rPr>
+        <w:t xml:space="preserve">認清事實</w:t>
+      </w:r>
+      <w:r>
+        <w:rPr>
+          <w:rFonts w:hint="eastAsia"/>
+        </w:rPr>
+        <w:t xml:space="preserve">——台灣本來就在美國的安全防線之內。</w:t>
+      </w:r>
+    </w:p>
+    <w:bookmarkEnd w:id="22"/>
+    <w:bookmarkStart w:id="23" w:name="Xc386a52e5db0c3b49866b9336eabf461cd38baa"/>
+    <w:p>
+      <w:pPr>
+        <w:pStyle w:val="Heading3"/>
+      </w:pPr>
+      <w:r>
+        <w:t xml:space="preserve">Message 2: A Compute Reciprocity Agreement (CRA).</w:t>
+      </w:r>
+    </w:p>
+    <w:p>
+      <w:pPr>
+        <w:pStyle w:val="FirstParagraph"/>
+      </w:pPr>
+      <w:r>
+        <w:rPr>
+          <w:rFonts w:hint="eastAsia"/>
+          <w:b/>
+          <w:bCs/>
+        </w:rPr>
+        <w:t xml:space="preserve">訊息二：簽一份「美台算力互惠協議」（Compute</w:t>
+      </w:r>
+      <w:r>
+        <w:rPr>
+          <w:b/>
+          <w:bCs/>
+        </w:rPr>
+        <w:t xml:space="preserve"> Reciprocity Agreement, </w:t>
+      </w:r>
+      <w:r>
+        <w:rPr>
+          <w:rFonts w:hint="eastAsia"/>
+          <w:b/>
+          <w:bCs/>
+        </w:rPr>
+        <w:t xml:space="preserve">CRA）。</w:t>
+      </w:r>
+    </w:p>
+    <w:p>
+      <w:pPr>
+        <w:pStyle w:val="BodyText"/>
+      </w:pPr>
+      <w:r>
+        <w:t xml:space="preserve">6/13 </w:t>
+      </w:r>
+      <w:r>
+        <w:rPr>
+          <w:rFonts w:hint="eastAsia"/>
+        </w:rPr>
+        <w:t xml:space="preserve">命令解決了一個問題（如何把前沿模型鎖在美國國安防線內），却創造了另一個問題（如何讓最重要的盟邦也在同一道防線內）。</w:t>
+      </w:r>
+    </w:p>
+    <w:p>
+      <w:pPr>
+        <w:pStyle w:val="BodyText"/>
+      </w:pPr>
+      <w:r>
+        <w:rPr>
+          <w:rFonts w:hint="eastAsia"/>
+        </w:rPr>
+        <w:t xml:space="preserve">解法不是「例外名單」——那種清單每季讓其他會員國不服。解法是</w:t>
+      </w:r>
+      <w:r>
+        <w:rPr>
+          <w:rFonts w:hint="eastAsia"/>
+          <w:b/>
+          <w:bCs/>
+        </w:rPr>
+        <w:t xml:space="preserve">雙邊架構協議</w:t>
+      </w:r>
+      <w:r>
+        <w:t xml:space="preserve">。</w:t>
+      </w:r>
+    </w:p>
+    <w:p>
+      <w:pPr>
+        <w:pStyle w:val="BodyText"/>
+      </w:pPr>
+      <w:r>
+        <w:rPr>
+          <w:rFonts w:hint="eastAsia"/>
+        </w:rPr>
+        <w:t xml:space="preserve">我提議，並相信台灣立法院跨黨派都能支持：</w:t>
+      </w:r>
+      <w:r>
+        <w:rPr>
+          <w:rFonts w:hint="eastAsia"/>
+          <w:b/>
+          <w:bCs/>
+        </w:rPr>
+        <w:t xml:space="preserve">簽一份「美台算力互惠協議」（U.S.-Taiwan</w:t>
+      </w:r>
+      <w:r>
+        <w:rPr>
+          <w:b/>
+          <w:bCs/>
+        </w:rPr>
         <w:t xml:space="preserve"> </w:t>
       </w:r>
       <w:r>
-        <w:t xml:space="preserve">There is no second source. There is no plan B. The chips that run Fable 5, Mythos 5, and every successor model are fabricated by Taiwanese hands, in Taiwanese fabs, with Taiwanese engineering. When TSMC committed</w:t>
+        <w:rPr>
+          <w:rFonts w:hint="eastAsia"/>
+          <w:b/>
+          <w:bCs/>
+        </w:rPr>
+        <w:t xml:space="preserve">CRA）</w:t>
+      </w:r>
+      <w:r>
+        <w:rPr>
+          <w:rFonts w:hint="eastAsia"/>
+        </w:rPr>
+        <w:t xml:space="preserve">。對等結構，Stargate</w:t>
       </w:r>
       <w:r>
         <w:t xml:space="preserve"> </w:t>
       </w:r>
-      <w:hyperlink r:id="rId22">
-        <w:r>
-          <w:rPr>
-            <w:rStyle w:val="Hyperlink"/>
-          </w:rPr>
-          <w:t xml:space="preserve">over USD 65 billion</w:t>
-        </w:r>
-      </w:hyperlink>
-      <w:r>
-        <w:t xml:space="preserve"> </w:t>
-      </w:r>
-      <w:r>
-        <w:t xml:space="preserve">to Arizona, when Delta Electronics expanded its Plano, Texas hub with 1,500 employees, when TECO renewed its 30-year Texas presence, when Foxconn announced a USD 10 billion Midwest commitment——these were not commercial decisions.</w:t>
-      </w:r>
-      <w:r>
-        <w:t xml:space="preserve"> </w:t>
-      </w:r>
-      <w:r>
-        <w:rPr>
-          <w:b/>
-          <w:bCs/>
-        </w:rPr>
-        <w:t xml:space="preserve">These were sovereign commitments</w:t>
-      </w:r>
-      <w:r>
-        <w:t xml:space="preserve">, made by a partner government that believes in shared compute futures.</w:t>
-      </w:r>
-    </w:p>
-    <w:p>
-      <w:pPr>
-        <w:pStyle w:val="BodyText"/>
-      </w:pPr>
-      <w:r>
-        <w:t xml:space="preserve">You do not lock out the supplier that builds your weapons.</w:t>
-      </w:r>
-      <w:r>
-        <w:t xml:space="preserve"> </w:t>
-      </w:r>
-      <w:r>
-        <w:t xml:space="preserve">You do not block from your platform the engineers who keep your fabs running.</w:t>
-      </w:r>
-      <w:r>
-        <w:t xml:space="preserve"> </w:t>
-      </w:r>
-      <w:r>
-        <w:t xml:space="preserve">And you do not, in 2026, draw the same red line around Taipei that you draw around Beijing.</w:t>
-      </w:r>
-    </w:p>
-    <w:p>
-      <w:pPr>
-        <w:pStyle w:val="BodyText"/>
-      </w:pPr>
-      <w:r>
-        <w:t xml:space="preserve">Our ask is concrete and unambiguous:</w:t>
-      </w:r>
-    </w:p>
-    <w:p>
-      <w:pPr>
-        <w:pStyle w:val="BlockText"/>
-      </w:pPr>
-      <w:r>
-        <w:rPr>
-          <w:b/>
-          <w:bCs/>
-        </w:rPr>
-        <w:t xml:space="preserve">Grant Taiwan</w:t>
-      </w:r>
-      <w:r>
-        <w:rPr>
-          <w:b/>
-          <w:bCs/>
-        </w:rPr>
-        <w:t xml:space="preserve"> </w:t>
-      </w:r>
-      <w:r>
-        <w:rPr>
-          <w:b/>
-          <w:bCs/>
-        </w:rPr>
-        <w:t xml:space="preserve">“Trusted Foundry / Trusted Compute Supplier”</w:t>
-      </w:r>
-      <w:r>
-        <w:rPr>
-          <w:b/>
-          <w:bCs/>
-        </w:rPr>
-        <w:t xml:space="preserve"> </w:t>
-      </w:r>
-      <w:r>
-        <w:rPr>
-          <w:b/>
-          <w:bCs/>
-        </w:rPr>
-        <w:t xml:space="preserve">status under the June 13 framework, equivalent to the treatment given to Lockheed Martin, Raytheon, and other Tier-1 defense partners.</w:t>
-      </w:r>
-    </w:p>
-    <w:p>
-      <w:pPr>
-        <w:pStyle w:val="FirstParagraph"/>
-      </w:pPr>
-      <w:r>
-        <w:t xml:space="preserve">This is not preferential treatment. This is honest classification. We are inside the security perimeter, not outside it.</w:t>
-      </w:r>
-    </w:p>
-    <w:bookmarkEnd w:id="23"/>
-    <w:bookmarkStart w:id="24" w:name="X72e118ed14e410dffd3be7ae299575402d06188"/>
-    <w:p>
-      <w:pPr>
-        <w:pStyle w:val="Heading3"/>
-      </w:pPr>
-      <w:r>
-        <w:t xml:space="preserve">Message 2: A Compute Reciprocity Agreement (CRA).</w:t>
-      </w:r>
-    </w:p>
-    <w:p>
-      <w:pPr>
-        <w:pStyle w:val="FirstParagraph"/>
-      </w:pPr>
-      <w:r>
-        <w:t xml:space="preserve">The June 13 directive solved one problem and created another.</w:t>
-      </w:r>
-    </w:p>
-    <w:p>
-      <w:pPr>
-        <w:pStyle w:val="BodyText"/>
-      </w:pPr>
-      <w:r>
-        <w:t xml:space="preserve">It solved: how to keep frontier models inside the U.S. national security perimeter.</w:t>
-      </w:r>
-      <w:r>
-        <w:t xml:space="preserve"> </w:t>
-      </w:r>
-      <w:r>
-        <w:t xml:space="preserve">It created: how to keep your most strategic ally inside the</w:t>
-      </w:r>
-      <w:r>
-        <w:t xml:space="preserve"> </w:t>
-      </w:r>
-      <w:r>
-        <w:rPr>
-          <w:b/>
-          <w:bCs/>
-        </w:rPr>
-        <w:t xml:space="preserve">same</w:t>
-      </w:r>
-      <w:r>
-        <w:t xml:space="preserve"> </w:t>
-      </w:r>
-      <w:r>
-        <w:t xml:space="preserve">perimeter.</w:t>
-      </w:r>
-    </w:p>
-    <w:p>
-      <w:pPr>
-        <w:pStyle w:val="BodyText"/>
-      </w:pPr>
-      <w:r>
-        <w:t xml:space="preserve">The answer is not exception lists——those age badly and create diplomatic friction every quarter. The answer is a</w:t>
-      </w:r>
-      <w:r>
-        <w:t xml:space="preserve"> </w:t>
-      </w:r>
-      <w:r>
-        <w:rPr>
-          <w:b/>
-          <w:bCs/>
-        </w:rPr>
-        <w:t xml:space="preserve">bilateral framework agreement</w:t>
-      </w:r>
-      <w:r>
-        <w:t xml:space="preserve">.</w:t>
-      </w:r>
-    </w:p>
-    <w:p>
-      <w:pPr>
-        <w:pStyle w:val="BodyText"/>
-      </w:pPr>
-      <w:r>
-        <w:t xml:space="preserve">I propose, and I believe a cross-party coalition in Taiwan’s Legislative Yuan would support:</w:t>
-      </w:r>
-    </w:p>
-    <w:p>
-      <w:pPr>
-        <w:pStyle w:val="BlockText"/>
-      </w:pPr>
-      <w:r>
-        <w:rPr>
-          <w:b/>
-          <w:bCs/>
-        </w:rPr>
-        <w:t xml:space="preserve">A U.S.-Taiwan Compute Reciprocity Agreement (CRA).</w:t>
-      </w:r>
-    </w:p>
-    <w:p>
-      <w:pPr>
-        <w:pStyle w:val="FirstParagraph"/>
-      </w:pPr>
-      <w:r>
-        <w:t xml:space="preserve">The structure is symmetric, simple, and Stargate-scale:</w:t>
+      <w:r>
+        <w:rPr>
+          <w:rFonts w:hint="eastAsia"/>
+        </w:rPr>
+        <w:t xml:space="preserve">規模：</w:t>
       </w:r>
     </w:p>
     <w:p>
@@ -2537,29 +2767,62 @@
       </w:pPr>
       <w:r>
         <w:rPr>
-          <w:b/>
-          <w:bCs/>
-        </w:rPr>
-        <w:t xml:space="preserve">Taiwan commits</w:t>
-      </w:r>
-      <w:r>
-        <w:t xml:space="preserve">, over a 5-year window, to a sovereign procurement envelope on the order of</w:t>
+          <w:rFonts w:hint="eastAsia"/>
+          <w:b/>
+          <w:bCs/>
+        </w:rPr>
+        <w:t xml:space="preserve">台灣承諾</w:t>
+      </w:r>
+      <w:r>
+        <w:rPr>
+          <w:rFonts w:hint="eastAsia"/>
+        </w:rPr>
+        <w:t xml:space="preserve">：5</w:t>
       </w:r>
       <w:r>
         <w:t xml:space="preserve"> </w:t>
       </w:r>
       <w:r>
         <w:rPr>
-          <w:b/>
-          <w:bCs/>
-        </w:rPr>
-        <w:t xml:space="preserve">USD 170 billion</w:t>
-      </w:r>
-      <w:r>
-        <w:t xml:space="preserve"> </w:t>
-      </w:r>
-      <w:r>
-        <w:t xml:space="preserve">in U.S.-supplied AI compute——training tokens, inference tokens, context capacity, dedicated cluster reservations. This is sovereign-grade demand, predictable, multi-year, contractually binding. (Order of magnitude only; actual numbers subject to executive and legislative negotiation.)</w:t>
+          <w:rFonts w:hint="eastAsia"/>
+        </w:rPr>
+        <w:t xml:space="preserve">年內，差不多</w:t>
+      </w:r>
+      <w:r>
+        <w:t xml:space="preserve"> 1,700 </w:t>
+      </w:r>
+      <w:r>
+        <w:rPr>
+          <w:rFonts w:hint="eastAsia"/>
+        </w:rPr>
+        <w:t xml:space="preserve">億美元規模的主權算力採購额度（訓練</w:t>
+      </w:r>
+      <w:r>
+        <w:t xml:space="preserve"> / </w:t>
+      </w:r>
+      <w:r>
+        <w:rPr>
+          <w:rFonts w:hint="eastAsia"/>
+        </w:rPr>
+        <w:t xml:space="preserve">推理</w:t>
+      </w:r>
+      <w:r>
+        <w:t xml:space="preserve"> token </w:t>
+      </w:r>
+      <w:r>
+        <w:rPr>
+          <w:rFonts w:hint="eastAsia"/>
+        </w:rPr>
+        <w:t xml:space="preserve">、上下文配額、專用</w:t>
+      </w:r>
+      <w:r>
+        <w:t xml:space="preserve"> cluster </w:t>
+      </w:r>
+      <w:r>
+        <w:rPr>
+          <w:rFonts w:hint="eastAsia"/>
+        </w:rPr>
+        <w:t xml:space="preserve">保留）。這是主權層級需求、可預期、多年期、有法律拘束力。（規模為說明用，實際數字需經行政與立法兩邊協商。）</w:t>
       </w:r>
     </w:p>
     <w:p>
@@ -2572,26 +2835,39 @@
       </w:pPr>
       <w:r>
         <w:rPr>
-          <w:b/>
-          <w:bCs/>
-        </w:rPr>
-        <w:t xml:space="preserve">The United States commits</w:t>
-      </w:r>
-      <w:r>
-        <w:t xml:space="preserve">, in return, to grant Taiwanese nationals and Taiwanese-registered entities</w:t>
+          <w:rFonts w:hint="eastAsia"/>
+          <w:b/>
+          <w:bCs/>
+        </w:rPr>
+        <w:t xml:space="preserve">美國承諾</w:t>
+      </w:r>
+      <w:r>
+        <w:rPr>
+          <w:rFonts w:hint="eastAsia"/>
+        </w:rPr>
+        <w:t xml:space="preserve">：註明台灣國民與法人為「</w:t>
+      </w:r>
+      <w:r>
+        <w:rPr>
+          <w:b/>
+          <w:bCs/>
+        </w:rPr>
+        <w:t xml:space="preserve">Allied User Status</w:t>
+      </w:r>
+      <w:r>
+        <w:rPr>
+          <w:rFonts w:hint="eastAsia"/>
+        </w:rPr>
+        <w:t xml:space="preserve">」（盟邦使用者），6/13</w:t>
       </w:r>
       <w:r>
         <w:t xml:space="preserve"> </w:t>
       </w:r>
       <w:r>
         <w:rPr>
-          <w:b/>
-          <w:bCs/>
-        </w:rPr>
-        <w:t xml:space="preserve">“Allied User Status”</w:t>
-      </w:r>
-      <w:r>
-        <w:t xml:space="preserve">——a formal classification under the June 13 framework that places Taiwan users in the same access tier as domestic U.S. users, with comparable due-process protections in the event of future restrictions.</w:t>
+          <w:rFonts w:hint="eastAsia"/>
+        </w:rPr>
+        <w:t xml:space="preserve">框架下訪問前沿模型的存取階層同於美國內部使用者，未來變動亦享有同等正當程序保障。</w:t>
       </w:r>
     </w:p>
     <w:p>
@@ -2599,58 +2875,63 @@
         <w:pStyle w:val="FirstParagraph"/>
       </w:pPr>
       <w:r>
-        <w:t xml:space="preserve">This is a deal both sides win on the merits.</w:t>
-      </w:r>
-    </w:p>
-    <w:p>
-      <w:pPr>
-        <w:pStyle w:val="BodyText"/>
-      </w:pPr>
-      <w:r>
-        <w:t xml:space="preserve">For Washington: predictable, sovereign-scale demand at a moment when Stargate, Stargate-2, and successor projects need anchor customers other than U.S. hyperscalers. For Taipei: insurance against the next June 13.</w:t>
-      </w:r>
-    </w:p>
-    <w:p>
-      <w:pPr>
-        <w:pStyle w:val="BodyText"/>
-      </w:pPr>
-      <w:r>
-        <w:t xml:space="preserve">For both: a precedent that turns</w:t>
+        <w:rPr>
+          <w:rFonts w:hint="eastAsia"/>
+        </w:rPr>
+        <w:t xml:space="preserve">這是一條雙贏交易：華府拿到穩定的主權級訂單（Stargate</w:t>
       </w:r>
       <w:r>
         <w:t xml:space="preserve"> </w:t>
       </w:r>
       <w:r>
-        <w:t xml:space="preserve">“ally”</w:t>
-      </w:r>
-      <w:r>
-        <w:t xml:space="preserve"> </w:t>
-      </w:r>
-      <w:r>
-        <w:t xml:space="preserve">into a</w:t>
-      </w:r>
-      <w:r>
-        <w:t xml:space="preserve"> </w:t>
-      </w:r>
-      <w:r>
-        <w:rPr>
-          <w:b/>
-          <w:bCs/>
-        </w:rPr>
-        <w:t xml:space="preserve">legal compute status</w:t>
-      </w:r>
-      <w:r>
-        <w:t xml:space="preserve">, not a State Department adjective.</w:t>
-      </w:r>
-    </w:p>
-    <w:bookmarkEnd w:id="24"/>
-    <w:bookmarkStart w:id="26" w:name="X4978691e2974d248e04e93078596f5fd8220c55"/>
+        <w:rPr>
+          <w:rFonts w:hint="eastAsia"/>
+        </w:rPr>
+        <w:t xml:space="preserve">系列需要這種錠定客戶）；台北拿到防下一次</w:t>
+      </w:r>
+      <w:r>
+        <w:t xml:space="preserve"> 6/13 </w:t>
+      </w:r>
+      <w:r>
+        <w:rPr>
+          <w:rFonts w:hint="eastAsia"/>
+        </w:rPr>
+        <w:t xml:space="preserve">的保險。</w:t>
+      </w:r>
+    </w:p>
+    <w:p>
+      <w:pPr>
+        <w:pStyle w:val="BodyText"/>
+      </w:pPr>
+      <w:r>
+        <w:rPr>
+          <w:rFonts w:hint="eastAsia"/>
+        </w:rPr>
+        <w:t xml:space="preserve">雙邊都拿到一個先例：</w:t>
+      </w:r>
+      <w:r>
+        <w:rPr>
+          <w:rFonts w:hint="eastAsia"/>
+          <w:b/>
+          <w:bCs/>
+        </w:rPr>
+        <w:t xml:space="preserve">把「盟邦」變成一個「法律算力地位」</w:t>
+      </w:r>
+      <w:r>
+        <w:rPr>
+          <w:rFonts w:hint="eastAsia"/>
+        </w:rPr>
+        <w:t xml:space="preserve">，不再只是國務院的形容詞。</w:t>
+      </w:r>
+    </w:p>
+    <w:bookmarkEnd w:id="23"/>
+    <w:bookmarkStart w:id="24" w:name="X6d4ef5b09d0653e800719f5ec36795dbd98fb23"/>
     <w:p>
       <w:pPr>
         <w:pStyle w:val="Heading3"/>
       </w:pPr>
       <w:r>
-        <w:t xml:space="preserve">Message 3: Taiwan as America’s Allied Compute Proxy in the Global South.</w:t>
+        <w:t xml:space="preserve">Message 3: Taiwan as America's Allied Compute Proxy in the Global South.</w:t>
       </w:r>
     </w:p>
     <w:p>
@@ -2658,98 +2939,132 @@
         <w:pStyle w:val="FirstParagraph"/>
       </w:pPr>
       <w:r>
-        <w:t xml:space="preserve">This is the message I most want Members of Congress to hear, because it solves a problem the United States has not yet fully named:</w:t>
-      </w:r>
-    </w:p>
-    <w:p>
-      <w:pPr>
-        <w:pStyle w:val="BodyText"/>
-      </w:pPr>
-      <w:r>
-        <w:rPr>
-          <w:b/>
-          <w:bCs/>
-        </w:rPr>
-        <w:t xml:space="preserve">The Global South is going to build sovereign compute. The only question is whose stack it runs on.</w:t>
-      </w:r>
-    </w:p>
-    <w:p>
-      <w:pPr>
-        <w:pStyle w:val="BodyText"/>
-      </w:pPr>
-      <w:r>
-        <w:t xml:space="preserve">Saudi Arabia is already moving. The UAE is already moving. Indonesia is moving. Brazil is moving. Each of them will, within five years, demand domestic AI compute that does not require a State Department license to operate. If the United States insists that all sovereign compute must run on American soil under American law, the Global South will build it elsewhere——and</w:t>
-      </w:r>
-      <w:r>
-        <w:t xml:space="preserve"> </w:t>
-      </w:r>
-      <w:r>
-        <w:t xml:space="preserve">“elsewhere,”</w:t>
-      </w:r>
-      <w:r>
-        <w:t xml:space="preserve"> </w:t>
-      </w:r>
-      <w:r>
-        <w:t xml:space="preserve">increasingly, means Beijing.</w:t>
-      </w:r>
-    </w:p>
-    <w:p>
-      <w:pPr>
-        <w:pStyle w:val="BodyText"/>
-      </w:pPr>
-      <w:r>
-        <w:t xml:space="preserve">Taiwan offers a third option.</w:t>
-      </w:r>
-    </w:p>
-    <w:p>
-      <w:pPr>
-        <w:pStyle w:val="BodyText"/>
-      </w:pPr>
-      <w:r>
-        <w:t xml:space="preserve">Our</w:t>
-      </w:r>
-      <w:r>
-        <w:t xml:space="preserve"> </w:t>
-      </w:r>
-      <w:hyperlink r:id="rId25">
+        <w:rPr>
+          <w:rFonts w:hint="eastAsia"/>
+          <w:b/>
+          <w:bCs/>
+        </w:rPr>
+        <w:t xml:space="preserve">訊息三：讓台灣成為美國在全球南方的盟邦算力代理人（Allied</w:t>
+      </w:r>
+      <w:r>
+        <w:rPr>
+          <w:b/>
+          <w:bCs/>
+        </w:rPr>
+        <w:t xml:space="preserve"> Compute </w:t>
+      </w:r>
+      <w:r>
+        <w:rPr>
+          <w:rFonts w:hint="eastAsia"/>
+          <w:b/>
+          <w:bCs/>
+        </w:rPr>
+        <w:t xml:space="preserve">Proxy）。</w:t>
+      </w:r>
+    </w:p>
+    <w:p>
+      <w:pPr>
+        <w:pStyle w:val="BodyText"/>
+      </w:pPr>
+      <w:r>
+        <w:rPr>
+          <w:rFonts w:hint="eastAsia"/>
+        </w:rPr>
+        <w:t xml:space="preserve">這是我最希望美國國會議員聽進去的一個訊息，因為它解決的是一個華府還沒有命名的問題：</w:t>
+      </w:r>
+    </w:p>
+    <w:p>
+      <w:pPr>
+        <w:pStyle w:val="BlockText"/>
+      </w:pPr>
+      <w:r>
+        <w:rPr>
+          <w:rFonts w:hint="eastAsia"/>
+          <w:b/>
+          <w:bCs/>
+        </w:rPr>
+        <w:t xml:space="preserve">全球南方必定會建自己的主權算力，唯一問題是：它跑誰的技術肌理。</w:t>
+      </w:r>
+    </w:p>
+    <w:p>
+      <w:pPr>
+        <w:pStyle w:val="FirstParagraph"/>
+      </w:pPr>
+      <w:r>
+        <w:rPr>
+          <w:rFonts w:hint="eastAsia"/>
+        </w:rPr>
+        <w:t xml:space="preserve">沙烏、阿聯酥、印尼、巴西都在動了。五年內他們都會要求「不需國務院許可即可運作」的本土</w:t>
+      </w:r>
+      <w:r>
+        <w:t xml:space="preserve"> AI </w:t>
+      </w:r>
+      <w:r>
+        <w:rPr>
+          <w:rFonts w:hint="eastAsia"/>
+        </w:rPr>
+        <w:t xml:space="preserve">算力。如果美國堅持「所有主權算力需在美國本土、適用美國法」，這些國家只會去別處取得——而「別處」越來越意味著北京。</w:t>
+      </w:r>
+    </w:p>
+    <w:p>
+      <w:pPr>
+        <w:pStyle w:val="BodyText"/>
+      </w:pPr>
+      <w:r>
+        <w:rPr>
+          <w:rFonts w:hint="eastAsia"/>
+          <w:b/>
+          <w:bCs/>
+        </w:rPr>
+        <w:t xml:space="preserve">台灣提供第三選項。</w:t>
+      </w:r>
+    </w:p>
+    <w:p>
+      <w:pPr>
+        <w:pStyle w:val="BodyText"/>
+      </w:pPr>
+      <w:r>
+        <w:rPr>
+          <w:rFonts w:hint="eastAsia"/>
+        </w:rPr>
+        <w:t xml:space="preserve">我們的</w:t>
+      </w:r>
+      <w:hyperlink r:id="rId11">
         <w:r>
           <w:rPr>
             <w:rStyle w:val="Hyperlink"/>
+            <w:rFonts w:hint="eastAsia"/>
           </w:rPr>
-          <w:t xml:space="preserve">overseas Compute Embassy proposal</w:t>
+          <w:t xml:space="preserve">海外超算大使館提案</w:t>
         </w:r>
       </w:hyperlink>
       <w:r>
-        <w:t xml:space="preserve"> </w:t>
-      </w:r>
-      <w:r>
-        <w:t xml:space="preserve">is</w:t>
-      </w:r>
-      <w:r>
-        <w:t xml:space="preserve"> </w:t>
-      </w:r>
-      <w:r>
-        <w:rPr>
-          <w:b/>
-          <w:bCs/>
-        </w:rPr>
-        <w:t xml:space="preserve">not a parallel system to American compute</w:t>
-      </w:r>
-      <w:r>
-        <w:t xml:space="preserve">. It is, if Washington wants it to be,</w:t>
-      </w:r>
-      <w:r>
-        <w:t xml:space="preserve"> </w:t>
-      </w:r>
-      <w:r>
-        <w:rPr>
-          <w:b/>
-          <w:bCs/>
-        </w:rPr>
-        <w:t xml:space="preserve">the allied extension of American compute into geographies the U.S. cannot enter directly</w:t>
-      </w:r>
-      <w:r>
-        <w:t xml:space="preserve">:</w:t>
+        <w:rPr>
+          <w:rFonts w:hint="eastAsia"/>
+          <w:b/>
+          <w:bCs/>
+        </w:rPr>
+        <w:t xml:space="preserve">不是美國算力的平行系統</w:t>
+      </w:r>
+      <w:r>
+        <w:rPr>
+          <w:rFonts w:hint="eastAsia"/>
+        </w:rPr>
+        <w:t xml:space="preserve">。如果華府愿意，它可以是</w:t>
+      </w:r>
+      <w:r>
+        <w:rPr>
+          <w:rFonts w:hint="eastAsia"/>
+          <w:b/>
+          <w:bCs/>
+        </w:rPr>
+        <w:t xml:space="preserve">美國算力在國務院進不了的地理區域的盟邦延伸</w:t>
+      </w:r>
+      <w:r>
+        <w:rPr>
+          <w:rFonts w:hint="eastAsia"/>
+        </w:rPr>
+        <w:t xml:space="preserve">：</w:t>
       </w:r>
     </w:p>
     <w:p>
@@ -2761,7 +3076,10 @@
         </w:numPr>
       </w:pPr>
       <w:r>
-        <w:t xml:space="preserve">Taiwanese-operated nodes in the Gulf, Southeast Asia, Latin America, and Northern Europe.</w:t>
+        <w:rPr>
+          <w:rFonts w:hint="eastAsia"/>
+        </w:rPr>
+        <w:t xml:space="preserve">台灣運營的節點陸續部署在波斯灣、東南亞、拉丁美洲、北歐。</w:t>
       </w:r>
     </w:p>
     <w:p>
@@ -2773,19 +3091,19 @@
         </w:numPr>
       </w:pPr>
       <w:r>
-        <w:t xml:space="preserve">Frontier U.S. models deployed at these nodes under</w:t>
+        <w:rPr>
+          <w:rFonts w:hint="eastAsia"/>
+        </w:rPr>
+        <w:t xml:space="preserve">美國前沿模型以「Allied</w:t>
       </w:r>
       <w:r>
         <w:t xml:space="preserve"> </w:t>
       </w:r>
       <w:r>
-        <w:t xml:space="preserve">“Allied Access”</w:t>
-      </w:r>
-      <w:r>
-        <w:t xml:space="preserve"> </w:t>
-      </w:r>
-      <w:r>
-        <w:t xml:space="preserve">terms——not unlocked to adversaries, but accessible to local sovereign users under a Taiwan-warranted framework.</w:t>
+        <w:rPr>
+          <w:rFonts w:hint="eastAsia"/>
+        </w:rPr>
+        <w:t xml:space="preserve">Access」條款部署在這些節點——不釋放給敵對國家，但可讓當地主權使用者透過台灣担保的架構使用。</w:t>
       </w:r>
     </w:p>
     <w:p>
@@ -2797,23 +3115,10 @@
         </w:numPr>
       </w:pPr>
       <w:r>
-        <w:t xml:space="preserve">A</w:t>
-      </w:r>
-      <w:r>
-        <w:t xml:space="preserve"> </w:t>
-      </w:r>
-      <w:r>
-        <w:rPr>
-          <w:b/>
-          <w:bCs/>
-        </w:rPr>
-        <w:t xml:space="preserve">“non-toxic ally proxy”</w:t>
-      </w:r>
-      <w:r>
-        <w:t xml:space="preserve"> </w:t>
-      </w:r>
-      <w:r>
-        <w:t xml:space="preserve">that lets the United States project compute soft power without projecting State Department friction.</w:t>
+        <w:rPr>
+          <w:rFonts w:hint="eastAsia"/>
+        </w:rPr>
+        <w:t xml:space="preserve">一個**「無毒盟邦代理人」**，讓美國可以投射算力軟實力、不用忍受國務院的外交摭擦。</w:t>
       </w:r>
     </w:p>
     <w:p>
@@ -2821,44 +3126,67 @@
         <w:pStyle w:val="FirstParagraph"/>
       </w:pPr>
       <w:r>
-        <w:t xml:space="preserve">Taiwan, in this configuration, is what the United Kingdom was to American finance in the 20th century: the trusted offshore extension. Not a competitor. Not a leak. The handshake that lets the system scale.</w:t>
-      </w:r>
-    </w:p>
-    <w:p>
-      <w:pPr>
-        <w:pStyle w:val="BodyText"/>
-      </w:pPr>
-      <w:r>
-        <w:t xml:space="preserve">President Trump’s America First doctrine has always understood that allies who</w:t>
-      </w:r>
-      <w:r>
-        <w:t xml:space="preserve"> </w:t>
-      </w:r>
-      <w:r>
-        <w:rPr>
-          <w:b/>
-          <w:bCs/>
-        </w:rPr>
-        <w:t xml:space="preserve">contribute</w:t>
-      </w:r>
-      <w:r>
-        <w:t xml:space="preserve"> </w:t>
-      </w:r>
-      <w:r>
-        <w:t xml:space="preserve">are different from allies who</w:t>
-      </w:r>
-      <w:r>
-        <w:t xml:space="preserve"> </w:t>
-      </w:r>
-      <w:r>
-        <w:rPr>
-          <w:b/>
-          <w:bCs/>
-        </w:rPr>
-        <w:t xml:space="preserve">free-ride</w:t>
-      </w:r>
-      <w:r>
-        <w:t xml:space="preserve">. Taiwan contributes. We have always contributed. Let us contribute on the most strategic frontier of this decade.</w:t>
+        <w:rPr>
+          <w:rFonts w:hint="eastAsia"/>
+        </w:rPr>
+        <w:t xml:space="preserve">台灣在這個架構中，就是</w:t>
+      </w:r>
+      <w:r>
+        <w:t xml:space="preserve"> 20 </w:t>
+      </w:r>
+      <w:r>
+        <w:rPr>
+          <w:rFonts w:hint="eastAsia"/>
+        </w:rPr>
+        <w:t xml:space="preserve">世紀英國為美國金融所扮演的角色：可信賴的離岸延伸。不是競爭者。不是漏洞。是讓整個系統能擴張的握手。</w:t>
+      </w:r>
+    </w:p>
+    <w:p>
+      <w:pPr>
+        <w:pStyle w:val="BodyText"/>
+      </w:pPr>
+      <w:r>
+        <w:rPr>
+          <w:rFonts w:hint="eastAsia"/>
+        </w:rPr>
+        <w:t xml:space="preserve">川普總統的</w:t>
+      </w:r>
+      <w:r>
+        <w:t xml:space="preserve"> America First </w:t>
+      </w:r>
+      <w:r>
+        <w:rPr>
+          <w:rFonts w:hint="eastAsia"/>
+        </w:rPr>
+        <w:t xml:space="preserve">教條一直明白：</w:t>
+      </w:r>
+      <w:r>
+        <w:rPr>
+          <w:rFonts w:hint="eastAsia"/>
+          <w:b/>
+          <w:bCs/>
+        </w:rPr>
+        <w:t xml:space="preserve">貢獻型盟邦</w:t>
+      </w:r>
+      <w:r>
+        <w:rPr>
+          <w:rFonts w:hint="eastAsia"/>
+        </w:rPr>
+        <w:t xml:space="preserve">與</w:t>
+      </w:r>
+      <w:r>
+        <w:rPr>
+          <w:rFonts w:hint="eastAsia"/>
+          <w:b/>
+          <w:bCs/>
+        </w:rPr>
+        <w:t xml:space="preserve">搭便車盟邦</w:t>
+      </w:r>
+      <w:r>
+        <w:rPr>
+          <w:rFonts w:hint="eastAsia"/>
+        </w:rPr>
+        <w:t xml:space="preserve">不同。台灣是貢獻型的。請讓我們在這個十年最關鍵的戰略前沿上貢獻。</w:t>
       </w:r>
     </w:p>
     <w:p>
@@ -2868,9 +3196,9 @@
         </w:pict>
       </w:r>
     </w:p>
-    <w:bookmarkEnd w:id="26"/>
-    <w:bookmarkEnd w:id="27"/>
-    <w:bookmarkStart w:id="28" w:name="五elevator-pitch兩個版本"/>
+    <w:bookmarkEnd w:id="24"/>
+    <w:bookmarkEnd w:id="25"/>
+    <w:bookmarkStart w:id="26" w:name="五elevator-pitch兩個版本"/>
     <w:p>
       <w:pPr>
         <w:pStyle w:val="Heading2"/>
@@ -2960,8 +3288,8 @@
         </w:pict>
       </w:r>
     </w:p>
-    <w:bookmarkEnd w:id="28"/>
-    <w:bookmarkStart w:id="29" w:name="六為什麼是現在ai-鎖國時代的第一天"/>
+    <w:bookmarkEnd w:id="26"/>
+    <w:bookmarkStart w:id="27" w:name="六為什麼是現在ai-鎖國時代的第一天"/>
     <w:p>
       <w:pPr>
         <w:pStyle w:val="Heading2"/>
@@ -3497,8 +3825,8 @@
         <w:t xml:space="preserve">這件事本身，就是論點的一部分。</w:t>
       </w:r>
     </w:p>
-    <w:bookmarkEnd w:id="29"/>
-    <w:bookmarkEnd w:id="30"/>
+    <w:bookmarkEnd w:id="27"/>
+    <w:bookmarkEnd w:id="28"/>
     <w:sectPr>
       <w:footnotePr>
         <w:numRestart w:val="eachSect"/>

</xml_diff>

<commit_message>
fix: AI sovereignty memo v3 — restore English Messages, keep Chinese summaries as collapsible
</commit_message>
<xml_diff>
--- a/public/files/ai-sovereignty-three-tables/ai-sovereignty-three-tables-zh.docx
+++ b/public/files/ai-sovereignty-three-tables/ai-sovereignty-three-tables-zh.docx
@@ -2,7 +2,7 @@
 <file path=word/document.xml><?xml version="1.0" encoding="utf-8"?>
 <w:document xmlns:w="http://schemas.openxmlformats.org/wordprocessingml/2006/main" xmlns:m="http://schemas.openxmlformats.org/officeDocument/2006/math" xmlns:r="http://schemas.openxmlformats.org/officeDocument/2006/relationships" xmlns:o="urn:schemas-microsoft-com:office:office" xmlns:v="urn:schemas-microsoft-com:vml" xmlns:w10="urn:schemas-microsoft-com:office:word" xmlns:a="http://schemas.openxmlformats.org/drawingml/2006/main" xmlns:pic="http://schemas.openxmlformats.org/drawingml/2006/picture" xmlns:wp="http://schemas.openxmlformats.org/drawingml/2006/wordprocessingDrawing">
   <w:body>
-    <w:bookmarkStart w:id="28" w:name="沒有算力主權就沒有國家主權"/>
+    <w:bookmarkStart w:id="30" w:name="沒有算力主權就沒有國家主權"/>
     <w:p>
       <w:pPr>
         <w:pStyle w:val="Heading1"/>
@@ -2337,7 +2337,7 @@
     </w:p>
     <w:bookmarkEnd w:id="20"/>
     <w:bookmarkEnd w:id="21"/>
-    <w:bookmarkStart w:id="25" w:name="四給川普總統給美國國會的三個訊息"/>
+    <w:bookmarkStart w:id="27" w:name="四給川普總統給美國國會的三個訊息"/>
     <w:p>
       <w:pPr>
         <w:pStyle w:val="Heading2"/>
@@ -2380,7 +2380,7 @@
         <w:t xml:space="preserve">自己的語言。</w:t>
       </w:r>
     </w:p>
-    <w:bookmarkStart w:id="22" w:name="X65d2a4625c3a22b8419f63ba4fa28aa0be0afe6"/>
+    <w:bookmarkStart w:id="23" w:name="X65d2a4625c3a22b8419f63ba4fa28aa0be0afe6"/>
     <w:p>
       <w:pPr>
         <w:pStyle w:val="Heading3"/>
@@ -2394,6 +2394,126 @@
         <w:pStyle w:val="FirstParagraph"/>
       </w:pPr>
       <w:r>
+        <w:t xml:space="preserve">President Trump, Members of Congress——</w:t>
+      </w:r>
+    </w:p>
+    <w:p>
+      <w:pPr>
+        <w:pStyle w:val="BodyText"/>
+      </w:pPr>
+      <w:r>
+        <w:t xml:space="preserve">The June 13 directive was correct in spirit. The United States must control its own frontier compute. No serious ally would dispute that.</w:t>
+      </w:r>
+    </w:p>
+    <w:p>
+      <w:pPr>
+        <w:pStyle w:val="BodyText"/>
+      </w:pPr>
+      <w:r>
+        <w:t xml:space="preserve">But the directive, as written, treats Taiwan the same way it treats adversarial states. That is a strategic miscalibration. Allow me to be blunt:</w:t>
+      </w:r>
+    </w:p>
+    <w:p>
+      <w:pPr>
+        <w:pStyle w:val="BodyText"/>
+      </w:pPr>
+      <w:r>
+        <w:rPr>
+          <w:b/>
+          <w:bCs/>
+        </w:rPr>
+        <w:t xml:space="preserve">Taiwan is America's only allied terafab supplier.</w:t>
+      </w:r>
+      <w:r>
+        <w:t xml:space="preserve"> </w:t>
+      </w:r>
+      <w:r>
+        <w:t xml:space="preserve">There is no second source. There is no plan B. The chips that run Fable 5, Mythos 5, and every successor model are fabricated by Taiwanese hands, in Taiwanese fabs, with Taiwanese engineering. When TSMC committed</w:t>
+      </w:r>
+      <w:r>
+        <w:t xml:space="preserve"> </w:t>
+      </w:r>
+      <w:hyperlink r:id="rId22">
+        <w:r>
+          <w:rPr>
+            <w:rStyle w:val="Hyperlink"/>
+          </w:rPr>
+          <w:t xml:space="preserve">over USD 65 billion</w:t>
+        </w:r>
+      </w:hyperlink>
+      <w:r>
+        <w:t xml:space="preserve"> </w:t>
+      </w:r>
+      <w:r>
+        <w:t xml:space="preserve">to Arizona, when Delta Electronics expanded its Plano, Texas hub with 1,500 employees, when TECO renewed its 30-year Texas presence, when Foxconn announced a USD 10 billion Midwest commitment——these were not commercial decisions.</w:t>
+      </w:r>
+      <w:r>
+        <w:t xml:space="preserve"> </w:t>
+      </w:r>
+      <w:r>
+        <w:rPr>
+          <w:b/>
+          <w:bCs/>
+        </w:rPr>
+        <w:t xml:space="preserve">These were sovereign commitments</w:t>
+      </w:r>
+      <w:r>
+        <w:t xml:space="preserve">, made by a partner government that believes in shared compute futures.</w:t>
+      </w:r>
+    </w:p>
+    <w:p>
+      <w:pPr>
+        <w:pStyle w:val="BodyText"/>
+      </w:pPr>
+      <w:r>
+        <w:t xml:space="preserve">You do not lock out the supplier that builds your weapons.</w:t>
+      </w:r>
+      <w:r>
+        <w:t xml:space="preserve"> </w:t>
+      </w:r>
+      <w:r>
+        <w:t xml:space="preserve">You do not block from your platform the engineers who keep your fabs running.</w:t>
+      </w:r>
+      <w:r>
+        <w:t xml:space="preserve"> </w:t>
+      </w:r>
+      <w:r>
+        <w:t xml:space="preserve">And you do not, in 2026, draw the same red line around Taipei that you draw around Beijing.</w:t>
+      </w:r>
+    </w:p>
+    <w:p>
+      <w:pPr>
+        <w:pStyle w:val="BodyText"/>
+      </w:pPr>
+      <w:r>
+        <w:t xml:space="preserve">Our ask is concrete and unambiguous:</w:t>
+      </w:r>
+    </w:p>
+    <w:p>
+      <w:pPr>
+        <w:pStyle w:val="BlockText"/>
+      </w:pPr>
+      <w:r>
+        <w:rPr>
+          <w:b/>
+          <w:bCs/>
+        </w:rPr>
+        <w:t xml:space="preserve">Grant Taiwan "Trusted Foundry / Trusted Compute Supplier" status under the June 13 framework, equivalent to the treatment given to Lockheed Martin, Raytheon, and other Tier-1 defense partners.</w:t>
+      </w:r>
+    </w:p>
+    <w:p>
+      <w:pPr>
+        <w:pStyle w:val="FirstParagraph"/>
+      </w:pPr>
+      <w:r>
+        <w:t xml:space="preserve">This is not preferential treatment. This is honest classification. We are inside the security perimeter, not outside it.</w:t>
+      </w:r>
+    </w:p>
+    <w:p>
+      <w:pPr>
+        <w:pStyle w:val="BodyText"/>
+      </w:pPr>
+      <w:r>
         <w:rPr>
           <w:rFonts w:hint="eastAsia"/>
           <w:b/>
@@ -2466,13 +2586,13 @@
         <w:t xml:space="preserve">供應者</w:t>
       </w:r>
       <w:r>
-        <w:t xml:space="preserve">。Fable 5、Mythos </w:t>
-      </w:r>
-      <w:r>
-        <w:rPr>
-          <w:rFonts w:hint="eastAsia"/>
-        </w:rPr>
-        <w:t xml:space="preserve">5以及未來所有繼任模型跑的晶片，由台灣人、台灣廠、台灣工程製造。台積電亞利桑那</w:t>
+        <w:t xml:space="preserve">。Fable 5、Mythos 5 </w:t>
+      </w:r>
+      <w:r>
+        <w:rPr>
+          <w:rFonts w:hint="eastAsia"/>
+        </w:rPr>
+        <w:t xml:space="preserve">以及未來所有繼任模型跑的晶片，由台灣人、台灣廠、台灣工程製造。台積電亞利桑那</w:t>
       </w:r>
       <w:r>
         <w:t xml:space="preserve"> 650 </w:t>
@@ -2634,8 +2754,8 @@
         <w:t xml:space="preserve">——台灣本來就在美國的安全防線之內。</w:t>
       </w:r>
     </w:p>
-    <w:bookmarkEnd w:id="22"/>
-    <w:bookmarkStart w:id="23" w:name="Xc386a52e5db0c3b49866b9336eabf461cd38baa"/>
+    <w:bookmarkEnd w:id="23"/>
+    <w:bookmarkStart w:id="24" w:name="Xc386a52e5db0c3b49866b9336eabf461cd38baa"/>
     <w:p>
       <w:pPr>
         <w:pStyle w:val="Heading3"/>
@@ -2649,112 +2769,86 @@
         <w:pStyle w:val="FirstParagraph"/>
       </w:pPr>
       <w:r>
-        <w:rPr>
-          <w:rFonts w:hint="eastAsia"/>
-          <w:b/>
-          <w:bCs/>
-        </w:rPr>
-        <w:t xml:space="preserve">訊息二：簽一份「美台算力互惠協議」（Compute</w:t>
-      </w:r>
-      <w:r>
-        <w:rPr>
-          <w:b/>
-          <w:bCs/>
-        </w:rPr>
-        <w:t xml:space="preserve"> Reciprocity Agreement, </w:t>
-      </w:r>
-      <w:r>
-        <w:rPr>
-          <w:rFonts w:hint="eastAsia"/>
-          <w:b/>
-          <w:bCs/>
-        </w:rPr>
-        <w:t xml:space="preserve">CRA）。</w:t>
-      </w:r>
-    </w:p>
-    <w:p>
-      <w:pPr>
-        <w:pStyle w:val="BodyText"/>
-      </w:pPr>
-      <w:r>
-        <w:t xml:space="preserve">6/13 </w:t>
-      </w:r>
-      <w:r>
-        <w:rPr>
-          <w:rFonts w:hint="eastAsia"/>
-        </w:rPr>
-        <w:t xml:space="preserve">命令解決了一個問題（如何把前沿模型鎖在美國國安防線內），却創造了另一個問題（如何讓最重要的盟邦也在同一道防線內）。</w:t>
-      </w:r>
-    </w:p>
-    <w:p>
-      <w:pPr>
-        <w:pStyle w:val="BodyText"/>
-      </w:pPr>
-      <w:r>
-        <w:rPr>
-          <w:rFonts w:hint="eastAsia"/>
-        </w:rPr>
-        <w:t xml:space="preserve">解法不是「例外名單」——那種清單每季讓其他會員國不服。解法是</w:t>
-      </w:r>
-      <w:r>
-        <w:rPr>
-          <w:rFonts w:hint="eastAsia"/>
-          <w:b/>
-          <w:bCs/>
-        </w:rPr>
-        <w:t xml:space="preserve">雙邊架構協議</w:t>
-      </w:r>
-      <w:r>
-        <w:t xml:space="preserve">。</w:t>
-      </w:r>
-    </w:p>
-    <w:p>
-      <w:pPr>
-        <w:pStyle w:val="BodyText"/>
-      </w:pPr>
-      <w:r>
-        <w:rPr>
-          <w:rFonts w:hint="eastAsia"/>
-        </w:rPr>
-        <w:t xml:space="preserve">我提議，並相信台灣立法院跨黨派都能支持：</w:t>
-      </w:r>
-      <w:r>
-        <w:rPr>
-          <w:rFonts w:hint="eastAsia"/>
-          <w:b/>
-          <w:bCs/>
-        </w:rPr>
-        <w:t xml:space="preserve">簽一份「美台算力互惠協議」（U.S.-Taiwan</w:t>
-      </w:r>
-      <w:r>
-        <w:rPr>
-          <w:b/>
-          <w:bCs/>
-        </w:rPr>
-        <w:t xml:space="preserve"> </w:t>
-      </w:r>
-      <w:r>
-        <w:rPr>
-          <w:rFonts w:hint="eastAsia"/>
-          <w:b/>
-          <w:bCs/>
-        </w:rPr>
-        <w:t xml:space="preserve">CRA）</w:t>
-      </w:r>
-      <w:r>
-        <w:rPr>
-          <w:rFonts w:hint="eastAsia"/>
-        </w:rPr>
-        <w:t xml:space="preserve">。對等結構，Stargate</w:t>
-      </w:r>
-      <w:r>
-        <w:t xml:space="preserve"> </w:t>
-      </w:r>
-      <w:r>
-        <w:rPr>
-          <w:rFonts w:hint="eastAsia"/>
-        </w:rPr>
-        <w:t xml:space="preserve">規模：</w:t>
+        <w:t xml:space="preserve">The June 13 directive solved one problem and created another.</w:t>
+      </w:r>
+    </w:p>
+    <w:p>
+      <w:pPr>
+        <w:pStyle w:val="BodyText"/>
+      </w:pPr>
+      <w:r>
+        <w:t xml:space="preserve">It solved: how to keep frontier models inside the U.S. national security perimeter.</w:t>
+      </w:r>
+      <w:r>
+        <w:t xml:space="preserve"> </w:t>
+      </w:r>
+      <w:r>
+        <w:t xml:space="preserve">It created: how to keep your most strategic ally inside the</w:t>
+      </w:r>
+      <w:r>
+        <w:t xml:space="preserve"> </w:t>
+      </w:r>
+      <w:r>
+        <w:rPr>
+          <w:b/>
+          <w:bCs/>
+        </w:rPr>
+        <w:t xml:space="preserve">same</w:t>
+      </w:r>
+      <w:r>
+        <w:t xml:space="preserve"> </w:t>
+      </w:r>
+      <w:r>
+        <w:t xml:space="preserve">perimeter.</w:t>
+      </w:r>
+    </w:p>
+    <w:p>
+      <w:pPr>
+        <w:pStyle w:val="BodyText"/>
+      </w:pPr>
+      <w:r>
+        <w:t xml:space="preserve">The answer is not exception lists——those age badly and create diplomatic friction every quarter. The answer is a</w:t>
+      </w:r>
+      <w:r>
+        <w:t xml:space="preserve"> </w:t>
+      </w:r>
+      <w:r>
+        <w:rPr>
+          <w:b/>
+          <w:bCs/>
+        </w:rPr>
+        <w:t xml:space="preserve">bilateral framework agreement</w:t>
+      </w:r>
+      <w:r>
+        <w:t xml:space="preserve">.</w:t>
+      </w:r>
+    </w:p>
+    <w:p>
+      <w:pPr>
+        <w:pStyle w:val="BodyText"/>
+      </w:pPr>
+      <w:r>
+        <w:t xml:space="preserve">I propose, and I believe a cross-party coalition in Taiwan's Legislative Yuan would support:</w:t>
+      </w:r>
+    </w:p>
+    <w:p>
+      <w:pPr>
+        <w:pStyle w:val="BlockText"/>
+      </w:pPr>
+      <w:r>
+        <w:rPr>
+          <w:b/>
+          <w:bCs/>
+        </w:rPr>
+        <w:t xml:space="preserve">A U.S.-Taiwan Compute Reciprocity Agreement (CRA).</w:t>
+      </w:r>
+    </w:p>
+    <w:p>
+      <w:pPr>
+        <w:pStyle w:val="FirstParagraph"/>
+      </w:pPr>
+      <w:r>
+        <w:t xml:space="preserve">The structure is symmetric, simple, and Stargate-scale:</w:t>
       </w:r>
     </w:p>
     <w:p>
@@ -2767,62 +2861,29 @@
       </w:pPr>
       <w:r>
         <w:rPr>
-          <w:rFonts w:hint="eastAsia"/>
-          <w:b/>
-          <w:bCs/>
-        </w:rPr>
-        <w:t xml:space="preserve">台灣承諾</w:t>
-      </w:r>
-      <w:r>
-        <w:rPr>
-          <w:rFonts w:hint="eastAsia"/>
-        </w:rPr>
-        <w:t xml:space="preserve">：5</w:t>
-      </w:r>
-      <w:r>
-        <w:t xml:space="preserve"> </w:t>
-      </w:r>
-      <w:r>
-        <w:rPr>
-          <w:rFonts w:hint="eastAsia"/>
-        </w:rPr>
-        <w:t xml:space="preserve">年內，差不多</w:t>
-      </w:r>
-      <w:r>
-        <w:t xml:space="preserve"> 1,700 </w:t>
-      </w:r>
-      <w:r>
-        <w:rPr>
-          <w:rFonts w:hint="eastAsia"/>
-        </w:rPr>
-        <w:t xml:space="preserve">億美元規模的主權算力採購额度（訓練</w:t>
-      </w:r>
-      <w:r>
-        <w:t xml:space="preserve"> / </w:t>
-      </w:r>
-      <w:r>
-        <w:rPr>
-          <w:rFonts w:hint="eastAsia"/>
-        </w:rPr>
-        <w:t xml:space="preserve">推理</w:t>
-      </w:r>
-      <w:r>
-        <w:t xml:space="preserve"> token </w:t>
-      </w:r>
-      <w:r>
-        <w:rPr>
-          <w:rFonts w:hint="eastAsia"/>
-        </w:rPr>
-        <w:t xml:space="preserve">、上下文配額、專用</w:t>
-      </w:r>
-      <w:r>
-        <w:t xml:space="preserve"> cluster </w:t>
-      </w:r>
-      <w:r>
-        <w:rPr>
-          <w:rFonts w:hint="eastAsia"/>
-        </w:rPr>
-        <w:t xml:space="preserve">保留）。這是主權層級需求、可預期、多年期、有法律拘束力。（規模為說明用，實際數字需經行政與立法兩邊協商。）</w:t>
+          <w:b/>
+          <w:bCs/>
+        </w:rPr>
+        <w:t xml:space="preserve">Taiwan commits</w:t>
+      </w:r>
+      <w:r>
+        <w:t xml:space="preserve">, over a 5-year window, to a sovereign procurement envelope on the order of</w:t>
+      </w:r>
+      <w:r>
+        <w:t xml:space="preserve"> </w:t>
+      </w:r>
+      <w:r>
+        <w:rPr>
+          <w:b/>
+          <w:bCs/>
+        </w:rPr>
+        <w:t xml:space="preserve">USD 170 billion</w:t>
+      </w:r>
+      <w:r>
+        <w:t xml:space="preserve"> </w:t>
+      </w:r>
+      <w:r>
+        <w:t xml:space="preserve">in U.S.-supplied AI compute——training tokens, inference tokens, context capacity, dedicated cluster reservations. This is sovereign-grade demand, predictable, multi-year, contractually binding. (Order of magnitude only; actual numbers subject to executive and legislative negotiation.)</w:t>
       </w:r>
     </w:p>
     <w:p>
@@ -2835,6 +2896,256 @@
       </w:pPr>
       <w:r>
         <w:rPr>
+          <w:b/>
+          <w:bCs/>
+        </w:rPr>
+        <w:t xml:space="preserve">The United States commits</w:t>
+      </w:r>
+      <w:r>
+        <w:t xml:space="preserve">, in return, to grant Taiwanese nationals and Taiwanese-registered entities</w:t>
+      </w:r>
+      <w:r>
+        <w:t xml:space="preserve"> </w:t>
+      </w:r>
+      <w:r>
+        <w:rPr>
+          <w:b/>
+          <w:bCs/>
+        </w:rPr>
+        <w:t xml:space="preserve">"Allied User Status"</w:t>
+      </w:r>
+      <w:r>
+        <w:t xml:space="preserve">——a formal classification under the June 13 framework that places Taiwan users in the same access tier as domestic U.S. users, with comparable due-process protections in the event of future restrictions.</w:t>
+      </w:r>
+    </w:p>
+    <w:p>
+      <w:pPr>
+        <w:pStyle w:val="FirstParagraph"/>
+      </w:pPr>
+      <w:r>
+        <w:t xml:space="preserve">This is a deal both sides win on the merits.</w:t>
+      </w:r>
+    </w:p>
+    <w:p>
+      <w:pPr>
+        <w:pStyle w:val="BodyText"/>
+      </w:pPr>
+      <w:r>
+        <w:t xml:space="preserve">For Washington: predictable, sovereign-scale demand at a moment when Stargate, Stargate-2, and successor projects need anchor customers other than U.S. hyperscalers. For Taipei: insurance against the next June 13.</w:t>
+      </w:r>
+    </w:p>
+    <w:p>
+      <w:pPr>
+        <w:pStyle w:val="BodyText"/>
+      </w:pPr>
+      <w:r>
+        <w:t xml:space="preserve">For both: a precedent that turns "ally" into a</w:t>
+      </w:r>
+      <w:r>
+        <w:t xml:space="preserve"> </w:t>
+      </w:r>
+      <w:r>
+        <w:rPr>
+          <w:b/>
+          <w:bCs/>
+        </w:rPr>
+        <w:t xml:space="preserve">legal compute status</w:t>
+      </w:r>
+      <w:r>
+        <w:t xml:space="preserve">, not a State Department adjective.</w:t>
+      </w:r>
+    </w:p>
+    <w:p>
+      <w:pPr>
+        <w:pStyle w:val="BodyText"/>
+      </w:pPr>
+      <w:r>
+        <w:rPr>
+          <w:rFonts w:hint="eastAsia"/>
+          <w:b/>
+          <w:bCs/>
+        </w:rPr>
+        <w:t xml:space="preserve">訊息二：簽一份「美台算力互惠協議」（Compute</w:t>
+      </w:r>
+      <w:r>
+        <w:rPr>
+          <w:b/>
+          <w:bCs/>
+        </w:rPr>
+        <w:t xml:space="preserve"> Reciprocity Agreement, </w:t>
+      </w:r>
+      <w:r>
+        <w:rPr>
+          <w:rFonts w:hint="eastAsia"/>
+          <w:b/>
+          <w:bCs/>
+        </w:rPr>
+        <w:t xml:space="preserve">CRA）。</w:t>
+      </w:r>
+    </w:p>
+    <w:p>
+      <w:pPr>
+        <w:pStyle w:val="BodyText"/>
+      </w:pPr>
+      <w:r>
+        <w:t xml:space="preserve">6/13 </w:t>
+      </w:r>
+      <w:r>
+        <w:rPr>
+          <w:rFonts w:hint="eastAsia"/>
+        </w:rPr>
+        <w:t xml:space="preserve">命令解決了一個問題（如何把前沿模型鎖在美國國安防線內），却創造了另一個問題（如何讓最重要的盟邦也在同一道防線內）。</w:t>
+      </w:r>
+    </w:p>
+    <w:p>
+      <w:pPr>
+        <w:pStyle w:val="BodyText"/>
+      </w:pPr>
+      <w:r>
+        <w:rPr>
+          <w:rFonts w:hint="eastAsia"/>
+        </w:rPr>
+        <w:t xml:space="preserve">解法不是「例外名單」——那種清單每季讓其他會員國不服。解法是</w:t>
+      </w:r>
+      <w:r>
+        <w:rPr>
+          <w:rFonts w:hint="eastAsia"/>
+          <w:b/>
+          <w:bCs/>
+        </w:rPr>
+        <w:t xml:space="preserve">雙邊架構協議</w:t>
+      </w:r>
+      <w:r>
+        <w:t xml:space="preserve">。</w:t>
+      </w:r>
+    </w:p>
+    <w:p>
+      <w:pPr>
+        <w:pStyle w:val="BodyText"/>
+      </w:pPr>
+      <w:r>
+        <w:rPr>
+          <w:rFonts w:hint="eastAsia"/>
+        </w:rPr>
+        <w:t xml:space="preserve">我提議，並相信台灣立法院跨黨派都能支持：</w:t>
+      </w:r>
+      <w:r>
+        <w:rPr>
+          <w:rFonts w:hint="eastAsia"/>
+          <w:b/>
+          <w:bCs/>
+        </w:rPr>
+        <w:t xml:space="preserve">簽一份「美台算力互惠協議」（U.S.-Taiwan</w:t>
+      </w:r>
+      <w:r>
+        <w:rPr>
+          <w:b/>
+          <w:bCs/>
+        </w:rPr>
+        <w:t xml:space="preserve"> </w:t>
+      </w:r>
+      <w:r>
+        <w:rPr>
+          <w:rFonts w:hint="eastAsia"/>
+          <w:b/>
+          <w:bCs/>
+        </w:rPr>
+        <w:t xml:space="preserve">CRA）</w:t>
+      </w:r>
+      <w:r>
+        <w:rPr>
+          <w:rFonts w:hint="eastAsia"/>
+        </w:rPr>
+        <w:t xml:space="preserve">。對等結構，Stargate</w:t>
+      </w:r>
+      <w:r>
+        <w:t xml:space="preserve"> </w:t>
+      </w:r>
+      <w:r>
+        <w:rPr>
+          <w:rFonts w:hint="eastAsia"/>
+        </w:rPr>
+        <w:t xml:space="preserve">規模：</w:t>
+      </w:r>
+    </w:p>
+    <w:p>
+      <w:pPr>
+        <w:pStyle w:val="Compact"/>
+        <w:numPr>
+          <w:ilvl w:val="0"/>
+          <w:numId w:val="1008"/>
+        </w:numPr>
+      </w:pPr>
+      <w:r>
+        <w:rPr>
+          <w:rFonts w:hint="eastAsia"/>
+          <w:b/>
+          <w:bCs/>
+        </w:rPr>
+        <w:t xml:space="preserve">台灣承諾</w:t>
+      </w:r>
+      <w:r>
+        <w:rPr>
+          <w:rFonts w:hint="eastAsia"/>
+        </w:rPr>
+        <w:t xml:space="preserve">：5</w:t>
+      </w:r>
+      <w:r>
+        <w:t xml:space="preserve"> </w:t>
+      </w:r>
+      <w:r>
+        <w:rPr>
+          <w:rFonts w:hint="eastAsia"/>
+        </w:rPr>
+        <w:t xml:space="preserve">年內，差不多</w:t>
+      </w:r>
+      <w:r>
+        <w:t xml:space="preserve"> 1,700 </w:t>
+      </w:r>
+      <w:r>
+        <w:rPr>
+          <w:rFonts w:hint="eastAsia"/>
+        </w:rPr>
+        <w:t xml:space="preserve">億美元規模的主權算力採購额度（訓練</w:t>
+      </w:r>
+      <w:r>
+        <w:t xml:space="preserve"> / </w:t>
+      </w:r>
+      <w:r>
+        <w:rPr>
+          <w:rFonts w:hint="eastAsia"/>
+        </w:rPr>
+        <w:t xml:space="preserve">推理</w:t>
+      </w:r>
+      <w:r>
+        <w:t xml:space="preserve"> </w:t>
+      </w:r>
+      <w:r>
+        <w:rPr>
+          <w:rFonts w:hint="eastAsia"/>
+        </w:rPr>
+        <w:t xml:space="preserve">token、上下文配額、專用</w:t>
+      </w:r>
+      <w:r>
+        <w:t xml:space="preserve"> cluster </w:t>
+      </w:r>
+      <w:r>
+        <w:rPr>
+          <w:rFonts w:hint="eastAsia"/>
+        </w:rPr>
+        <w:t xml:space="preserve">保留）。這是主權層級需求、可預期、多年期、有法律拘束力。（規模為說明用，實際數字需經行政與立法兩邊協商。）</w:t>
+      </w:r>
+    </w:p>
+    <w:p>
+      <w:pPr>
+        <w:pStyle w:val="Compact"/>
+        <w:numPr>
+          <w:ilvl w:val="0"/>
+          <w:numId w:val="1008"/>
+        </w:numPr>
+      </w:pPr>
+      <w:r>
+        <w:rPr>
           <w:rFonts w:hint="eastAsia"/>
           <w:b/>
           <w:bCs/>
@@ -2924,8 +3235,8 @@
         <w:t xml:space="preserve">，不再只是國務院的形容詞。</w:t>
       </w:r>
     </w:p>
-    <w:bookmarkEnd w:id="23"/>
-    <w:bookmarkStart w:id="24" w:name="X6d4ef5b09d0653e800719f5ec36795dbd98fb23"/>
+    <w:bookmarkEnd w:id="24"/>
+    <w:bookmarkStart w:id="26" w:name="X6d4ef5b09d0653e800719f5ec36795dbd98fb23"/>
     <w:p>
       <w:pPr>
         <w:pStyle w:val="Heading3"/>
@@ -2937,6 +3248,190 @@
     <w:p>
       <w:pPr>
         <w:pStyle w:val="FirstParagraph"/>
+      </w:pPr>
+      <w:r>
+        <w:t xml:space="preserve">This is the message I most want Members of Congress to hear, because it solves a problem the United States has not yet fully named:</w:t>
+      </w:r>
+    </w:p>
+    <w:p>
+      <w:pPr>
+        <w:pStyle w:val="BodyText"/>
+      </w:pPr>
+      <w:r>
+        <w:rPr>
+          <w:b/>
+          <w:bCs/>
+        </w:rPr>
+        <w:t xml:space="preserve">The Global South is going to build sovereign compute. The only question is whose stack it runs on.</w:t>
+      </w:r>
+    </w:p>
+    <w:p>
+      <w:pPr>
+        <w:pStyle w:val="BodyText"/>
+      </w:pPr>
+      <w:r>
+        <w:t xml:space="preserve">Saudi Arabia is already moving. The UAE is already moving. Indonesia is moving. Brazil is moving. Each of them will, within five years, demand domestic AI compute that does not require a State Department license to operate. If the United States insists that all sovereign compute must run on American soil under American law, the Global South will build it elsewhere——and "elsewhere," increasingly, means Beijing.</w:t>
+      </w:r>
+    </w:p>
+    <w:p>
+      <w:pPr>
+        <w:pStyle w:val="BodyText"/>
+      </w:pPr>
+      <w:r>
+        <w:t xml:space="preserve">Taiwan offers a third option.</w:t>
+      </w:r>
+    </w:p>
+    <w:p>
+      <w:pPr>
+        <w:pStyle w:val="BodyText"/>
+      </w:pPr>
+      <w:r>
+        <w:t xml:space="preserve">Our</w:t>
+      </w:r>
+      <w:r>
+        <w:t xml:space="preserve"> </w:t>
+      </w:r>
+      <w:hyperlink r:id="rId25">
+        <w:r>
+          <w:rPr>
+            <w:rStyle w:val="Hyperlink"/>
+          </w:rPr>
+          <w:t xml:space="preserve">overseas Compute Embassy proposal</w:t>
+        </w:r>
+      </w:hyperlink>
+      <w:r>
+        <w:t xml:space="preserve"> </w:t>
+      </w:r>
+      <w:r>
+        <w:t xml:space="preserve">is</w:t>
+      </w:r>
+      <w:r>
+        <w:t xml:space="preserve"> </w:t>
+      </w:r>
+      <w:r>
+        <w:rPr>
+          <w:b/>
+          <w:bCs/>
+        </w:rPr>
+        <w:t xml:space="preserve">not a parallel system to American compute</w:t>
+      </w:r>
+      <w:r>
+        <w:t xml:space="preserve">. It is, if Washington wants it to be,</w:t>
+      </w:r>
+      <w:r>
+        <w:t xml:space="preserve"> </w:t>
+      </w:r>
+      <w:r>
+        <w:rPr>
+          <w:b/>
+          <w:bCs/>
+        </w:rPr>
+        <w:t xml:space="preserve">the allied extension of American compute into geographies the U.S. cannot enter directly</w:t>
+      </w:r>
+      <w:r>
+        <w:t xml:space="preserve">:</w:t>
+      </w:r>
+    </w:p>
+    <w:p>
+      <w:pPr>
+        <w:pStyle w:val="Compact"/>
+        <w:numPr>
+          <w:ilvl w:val="0"/>
+          <w:numId w:val="1009"/>
+        </w:numPr>
+      </w:pPr>
+      <w:r>
+        <w:t xml:space="preserve">Taiwanese-operated nodes in the Gulf, Southeast Asia, Latin America, and Northern Europe.</w:t>
+      </w:r>
+    </w:p>
+    <w:p>
+      <w:pPr>
+        <w:pStyle w:val="Compact"/>
+        <w:numPr>
+          <w:ilvl w:val="0"/>
+          <w:numId w:val="1009"/>
+        </w:numPr>
+      </w:pPr>
+      <w:r>
+        <w:t xml:space="preserve">Frontier U.S. models deployed at these nodes under "Allied Access" terms——not unlocked to adversaries, but accessible to local sovereign users under a Taiwan-warranted framework.</w:t>
+      </w:r>
+    </w:p>
+    <w:p>
+      <w:pPr>
+        <w:pStyle w:val="Compact"/>
+        <w:numPr>
+          <w:ilvl w:val="0"/>
+          <w:numId w:val="1009"/>
+        </w:numPr>
+      </w:pPr>
+      <w:r>
+        <w:t xml:space="preserve">A</w:t>
+      </w:r>
+      <w:r>
+        <w:t xml:space="preserve"> </w:t>
+      </w:r>
+      <w:r>
+        <w:rPr>
+          <w:b/>
+          <w:bCs/>
+        </w:rPr>
+        <w:t xml:space="preserve">"non-toxic ally proxy"</w:t>
+      </w:r>
+      <w:r>
+        <w:t xml:space="preserve"> </w:t>
+      </w:r>
+      <w:r>
+        <w:t xml:space="preserve">that lets the United States project compute soft power without projecting State Department friction.</w:t>
+      </w:r>
+    </w:p>
+    <w:p>
+      <w:pPr>
+        <w:pStyle w:val="FirstParagraph"/>
+      </w:pPr>
+      <w:r>
+        <w:t xml:space="preserve">Taiwan, in this configuration, is what the United Kingdom was to American finance in the 20th century: the trusted offshore extension. Not a competitor. Not a leak. The handshake that lets the system scale.</w:t>
+      </w:r>
+    </w:p>
+    <w:p>
+      <w:pPr>
+        <w:pStyle w:val="BodyText"/>
+      </w:pPr>
+      <w:r>
+        <w:t xml:space="preserve">President Trump's America First doctrine has always understood that allies who</w:t>
+      </w:r>
+      <w:r>
+        <w:t xml:space="preserve"> </w:t>
+      </w:r>
+      <w:r>
+        <w:rPr>
+          <w:b/>
+          <w:bCs/>
+        </w:rPr>
+        <w:t xml:space="preserve">contribute</w:t>
+      </w:r>
+      <w:r>
+        <w:t xml:space="preserve"> </w:t>
+      </w:r>
+      <w:r>
+        <w:t xml:space="preserve">are different from allies who</w:t>
+      </w:r>
+      <w:r>
+        <w:t xml:space="preserve"> </w:t>
+      </w:r>
+      <w:r>
+        <w:rPr>
+          <w:b/>
+          <w:bCs/>
+        </w:rPr>
+        <w:t xml:space="preserve">free-ride</w:t>
+      </w:r>
+      <w:r>
+        <w:t xml:space="preserve">. Taiwan contributes. We have always contributed. Let us contribute on the most strategic frontier of this decade.</w:t>
+      </w:r>
+    </w:p>
+    <w:p>
+      <w:pPr>
+        <w:pStyle w:val="BodyText"/>
       </w:pPr>
       <w:r>
         <w:rPr>
@@ -3072,7 +3567,7 @@
         <w:pStyle w:val="Compact"/>
         <w:numPr>
           <w:ilvl w:val="0"/>
-          <w:numId w:val="1008"/>
+          <w:numId w:val="1010"/>
         </w:numPr>
       </w:pPr>
       <w:r>
@@ -3087,7 +3582,7 @@
         <w:pStyle w:val="Compact"/>
         <w:numPr>
           <w:ilvl w:val="0"/>
-          <w:numId w:val="1008"/>
+          <w:numId w:val="1010"/>
         </w:numPr>
       </w:pPr>
       <w:r>
@@ -3111,7 +3606,7 @@
         <w:pStyle w:val="Compact"/>
         <w:numPr>
           <w:ilvl w:val="0"/>
-          <w:numId w:val="1008"/>
+          <w:numId w:val="1010"/>
         </w:numPr>
       </w:pPr>
       <w:r>
@@ -3196,9 +3691,9 @@
         </w:pict>
       </w:r>
     </w:p>
-    <w:bookmarkEnd w:id="24"/>
-    <w:bookmarkEnd w:id="25"/>
-    <w:bookmarkStart w:id="26" w:name="五elevator-pitch兩個版本"/>
+    <w:bookmarkEnd w:id="26"/>
+    <w:bookmarkEnd w:id="27"/>
+    <w:bookmarkStart w:id="28" w:name="五elevator-pitch兩個版本"/>
     <w:p>
       <w:pPr>
         <w:pStyle w:val="Heading2"/>
@@ -3288,8 +3783,8 @@
         </w:pict>
       </w:r>
     </w:p>
-    <w:bookmarkEnd w:id="26"/>
-    <w:bookmarkStart w:id="27" w:name="六為什麼是現在ai-鎖國時代的第一天"/>
+    <w:bookmarkEnd w:id="28"/>
+    <w:bookmarkStart w:id="29" w:name="六為什麼是現在ai-鎖國時代的第一天"/>
     <w:p>
       <w:pPr>
         <w:pStyle w:val="Heading2"/>
@@ -3722,7 +4217,7 @@
         <w:pStyle w:val="Compact"/>
         <w:numPr>
           <w:ilvl w:val="0"/>
-          <w:numId w:val="1009"/>
+          <w:numId w:val="1011"/>
         </w:numPr>
       </w:pPr>
       <w:r>
@@ -3737,7 +4232,7 @@
         <w:pStyle w:val="Compact"/>
         <w:numPr>
           <w:ilvl w:val="0"/>
-          <w:numId w:val="1009"/>
+          <w:numId w:val="1011"/>
         </w:numPr>
       </w:pPr>
       <w:r>
@@ -3755,7 +4250,7 @@
         <w:pStyle w:val="Compact"/>
         <w:numPr>
           <w:ilvl w:val="0"/>
-          <w:numId w:val="1009"/>
+          <w:numId w:val="1011"/>
         </w:numPr>
       </w:pPr>
       <w:r>
@@ -3825,8 +4320,8 @@
         <w:t xml:space="preserve">這件事本身，就是論點的一部分。</w:t>
       </w:r>
     </w:p>
-    <w:bookmarkEnd w:id="27"/>
-    <w:bookmarkEnd w:id="28"/>
+    <w:bookmarkEnd w:id="29"/>
+    <w:bookmarkEnd w:id="30"/>
     <w:sectPr>
       <w:footnotePr>
         <w:numRestart w:val="eachSect"/>
@@ -4180,6 +4675,12 @@
     <w:abstractNumId w:val="991"/>
   </w:num>
   <w:num w:numId="1009">
+    <w:abstractNumId w:val="991"/>
+  </w:num>
+  <w:num w:numId="1010">
+    <w:abstractNumId w:val="991"/>
+  </w:num>
+  <w:num w:numId="1011">
     <w:abstractNumId w:val="991"/>
   </w:num>
 </w:numbering>

</xml_diff>